<commit_message>
Update README and reports to clarify demo functionality and model predictions for unseen test images
</commit_message>
<xml_diff>
--- a/mini project report/SignSense_Report.docx
+++ b/mini project report/SignSense_Report.docx
@@ -1339,7 +1339,7 @@
           <w:sz w:val="24"/>
           <w:szCs w:val="24"/>
         </w:rPr>
-        <w:t xml:space="preserve">Traffic sign recognition is a key part of driver assistance systems and self-driving cars. This project, SignSense, classifies images of road traffic signs into 43 classes using deep learning on the German Traffic Sign Recognition Benchmark (GTSRB), which contains 39,209 training and 12,630 test images. We designed a compact convolutional neural network (CNN) trained from scratch on 32x32 images with data augmentation, dropout and batch normalization, and compared it with transfer learning using MobileNetV2 pre-trained on ImageNet. The custom CNN with batch normalization achieved 98.60% accuracy on the official test set using only 487,243 parameters. MobileNetV2 reached 88.30% after fine-tuning its top 60 layers, and only 66.75% with light fine-tuning. Error analysis shows that most mistakes involve triangular warning signs with small, similar symbols and rare classes. A Streamlit web application lets users upload a sign image and see the predicted sign, its confidence and the top-3 predictions.</w:t>
+        <w:t xml:space="preserve">Traffic sign recognition is a key part of driver assistance systems and self-driving cars. This project, SignSense, classifies images of road traffic signs into 43 classes using deep learning on the German Traffic Sign Recognition Benchmark (GTSRB), which contains 39,209 training and 12,630 test images. We designed a compact convolutional neural network (CNN) trained from scratch on 32x32 images with data augmentation, dropout and batch normalization, and compared it with transfer learning using MobileNetV2 pre-trained on ImageNet. The custom CNN with batch normalization achieved 98.60% accuracy on the official test set using only 487,243 parameters. MobileNetV2 reached 88.30% after fine-tuning its top 60 layers, and only 66.75% with light fine-tuning. Error analysis shows that most mistakes involve triangular warning signs with small, similar symbols and rare classes. A Streamlit web application shows the model's prediction, confidence and top-3 predictions for unseen test images.</w:t>
       </w:r>
     </w:p>
     <w:p>
@@ -4971,7 +4971,7 @@
           <w:sz w:val="24"/>
           <w:szCs w:val="24"/>
         </w:rPr>
-        <w:t xml:space="preserve">This project builds a small CNN from scratch, compares it with MobileNetV2 transfer learning, analyses the errors, and provides a web demo that predicts the sign in an uploaded image.</w:t>
+        <w:t xml:space="preserve">This project builds a small CNN from scratch, compares it with MobileNetV2 transfer learning, analyses the errors, and provides a web demo that predicts the sign in unseen test images.</w:t>
       </w:r>
     </w:p>
     <w:p>
@@ -5099,7 +5099,7 @@
           <w:sz w:val="24"/>
           <w:szCs w:val="24"/>
         </w:rPr>
-        <w:t xml:space="preserve">Build a web demo where a user uploads a sign image and gets the predicted sign and confidence.</w:t>
+        <w:t xml:space="preserve">Build a web demo that shows the predicted sign and its confidence for test images.</w:t>
       </w:r>
     </w:p>
     <w:p>
@@ -5437,7 +5437,7 @@
           <w:sz w:val="24"/>
           <w:szCs w:val="24"/>
         </w:rPr>
-        <w:t xml:space="preserve"> An input image (from the dataset or uploaded in the app) is read with OpenCV, converted from BGR to RGB and resized to 32x32 pixels for the custom CNN or 96x96 pixels for MobileNetV2. Pixel values are scaled (divided by 255 for the CNN; scaled to -1..1 for MobileNetV2) and labels are one-hot encoded.</w:t>
+        <w:t xml:space="preserve"> An input image (from the dataset, or a test image chosen in the app) is read with OpenCV, converted from BGR to RGB and resized to 32x32 pixels for the custom CNN or 96x96 pixels for MobileNetV2. Pixel values are scaled (divided by 255 for the CNN; scaled to -1..1 for MobileNetV2) and labels are one-hot encoded.</w:t>
       </w:r>
     </w:p>
     <w:p>
@@ -6042,7 +6042,7 @@
                 <w:sz w:val="24"/>
                 <w:szCs w:val="24"/>
               </w:rPr>
-              <w:t xml:space="preserve">Streamlit web app: upload, model choice, prediction, confidence, top-3 chart.</w:t>
+              <w:t xml:space="preserve">Streamlit web app: random test image, model choice, prediction, confidence, top-3 chart.</w:t>
             </w:r>
           </w:p>
         </w:tc>
@@ -6110,7 +6110,7 @@
       <w:r>
         <w:drawing>
           <wp:inline distT="0" distB="0" distL="0" distR="0">
-            <wp:extent cx="5120640" cy="1682496"/>
+            <wp:extent cx="5120640" cy="1463040"/>
             <wp:docPr id="5004" name="Figure 4"/>
             <wp:cNvGraphicFramePr>
               <a:graphicFrameLocks xmlns:a="http://schemas.openxmlformats.org/drawingml/2006/main" noChangeAspect="1"/>
@@ -6131,7 +6131,7 @@
                   <pic:spPr>
                     <a:xfrm>
                       <a:off x="0" y="0"/>
-                      <a:ext cx="5120640" cy="1682496"/>
+                      <a:ext cx="5120640" cy="1463040"/>
                     </a:xfrm>
                     <a:prstGeom prst="rect">
                       <a:avLst/>
@@ -6167,7 +6167,7 @@
       <w:r>
         <w:drawing>
           <wp:inline distT="0" distB="0" distL="0" distR="0">
-            <wp:extent cx="5120640" cy="3346704"/>
+            <wp:extent cx="5120640" cy="3200400"/>
             <wp:docPr id="5005" name="Figure 5"/>
             <wp:cNvGraphicFramePr>
               <a:graphicFrameLocks xmlns:a="http://schemas.openxmlformats.org/drawingml/2006/main" noChangeAspect="1"/>
@@ -6188,7 +6188,7 @@
                   <pic:spPr>
                     <a:xfrm>
                       <a:off x="0" y="0"/>
-                      <a:ext cx="5120640" cy="3346704"/>
+                      <a:ext cx="5120640" cy="3200400"/>
                     </a:xfrm>
                     <a:prstGeom prst="rect">
                       <a:avLst/>
@@ -8213,7 +8213,7 @@
           <w:sz w:val="24"/>
           <w:szCs w:val="24"/>
         </w:rPr>
-        <w:t xml:space="preserve"> with fewer than 0.5 million parameters, above the 95% target. MobileNetV2 transfer learning reached 88.30% after fine-tuning, showing that pre-trained ImageNet features do not transfer well to tiny, low-resolution sign images and that fine-tuning is essential. The remaining errors come mainly from similar triangular warning signs, rare classes and poor image quality. A Streamlit web app demonstrates the model on uploaded images.</w:t>
+        <w:t xml:space="preserve"> with fewer than 0.5 million parameters, above the 95% target. MobileNetV2 transfer learning reached 88.30% after fine-tuning, showing that pre-trained ImageNet features do not transfer well to tiny, low-resolution sign images and that fine-tuning is essential. The remaining errors come mainly from similar triangular warning signs, rare classes and poor image quality. A Streamlit web app demonstrates the model on unseen test images.</w:t>
       </w:r>
     </w:p>
     <w:p>
@@ -8231,6 +8231,26 @@
           <w:szCs w:val="28"/>
         </w:rPr>
         <w:t xml:space="preserve">6.1 Limitations and Future Scope</w:t>
+      </w:r>
+    </w:p>
+    <w:p>
+      <w:pPr>
+        <w:pStyle w:val="ListParagraph"/>
+        <w:numPr>
+          <w:ilvl w:val="0"/>
+          <w:numId w:val="90"/>
+        </w:numPr>
+        <w:spacing w:before="0" w:after="160" w:line="360" w:lineRule="auto"/>
+        <w:ind w:left="720" w:hanging="360"/>
+        <w:jc w:val="both"/>
+      </w:pPr>
+      <w:r>
+        <w:rPr>
+          <w:rFonts w:ascii="Times New Roman" w:eastAsia="Times New Roman" w:hAnsi="Times New Roman" w:cs="Times New Roman"/>
+          <w:sz w:val="24"/>
+          <w:szCs w:val="24"/>
+        </w:rPr>
+        <w:t xml:space="preserve">The models only know the 43 GTSRB classes: a sign from outside these classes is still forced into the closest known class, so the demo uses test images only.</w:t>
       </w:r>
     </w:p>
     <w:p>

</xml_diff>